<commit_message>
Update Part 2 submission - improved Task 3.2 response
</commit_message>
<xml_diff>
--- a/part02/DataAvengers_midterm_part02.docx
+++ b/part02/DataAvengers_midterm_part02.docx
@@ -9721,25 +9721,39 @@
     </w:p>
     <w:p>
       <w:pPr>
-        <w:tabs>
-          <w:tab w:val="left" w:pos="2996"/>
-        </w:tabs>
-      </w:pPr>
-      <w:r>
-        <w:t xml:space="preserve">There are some important benefits of the sharding approach used in this assignment. One </w:t>
-      </w:r>
-      <w:r>
-        <w:t>major</w:t>
-      </w:r>
-      <w:r>
-        <w:t xml:space="preserve"> advantage of using this technique is geographic data locality. Since data is split by region, users in the southeast and northeast can access data that is stored closer to them, and that can help the company improve performance. The next benefit that we found is independent scaling. If one shard grows faster, that shard can be upgraded without changing the whole syste</w:t>
-      </w:r>
-      <w:r>
-        <w:t xml:space="preserve">m. Also, sharding helps with failure isolation. If one shard fails, the other shard can continue working. Finally, each shard has smaller tables, so local queries can run faster because they need to scan less data. On the other hand, this sharding approach has some negative impacts. The biggest problems that I found was that cross-shard queries are harder because there is not all the data in one single shard. One example that demonstrates this is that is the company needs to find </w:t>
-      </w:r>
-      <w:r>
+        <w:pStyle w:val="font-claude-response-body"/>
+        <w:rPr>
+          <w:rFonts w:asciiTheme="minorHAnsi" w:eastAsiaTheme="minorHAnsi" w:hAnsiTheme="minorHAnsi" w:cstheme="minorBidi"/>
+          <w:kern w:val="2"/>
+          <w14:ligatures w14:val="standardContextual"/>
+        </w:rPr>
+      </w:pPr>
+      <w:r>
+        <w:rPr>
+          <w:rFonts w:asciiTheme="minorHAnsi" w:eastAsiaTheme="minorHAnsi" w:hAnsiTheme="minorHAnsi" w:cstheme="minorBidi"/>
+          <w:kern w:val="2"/>
+          <w14:ligatures w14:val="standardContextual"/>
+        </w:rPr>
+        <w:t>The sharding approach used in this assignment has some important benefits but also some clear drawbacks. One benefit is geographic data locality. Since the data is split by region, customers in the southeast and northeast can access data that is stored closer to them, which can reduce latency and improve response times. Another benefit is independent scaling. If one shard starts growing faster, the company can upgrade just that shard without needing to change the entire system. Sharding also provides fault isolation, which means that if one shard goes down, the other shard can keep working normally so the whole business does not stop. Also, because each shard holds a smaller portion of the total data, the tables are smaller and queries within each shard can run faster since there is less data to scan.</w:t>
+      </w:r>
+    </w:p>
+    <w:p>
+      <w:pPr>
+        <w:pStyle w:val="font-claude-response-body"/>
+        <w:rPr>
+          <w:rFonts w:asciiTheme="minorHAnsi" w:eastAsiaTheme="minorHAnsi" w:hAnsiTheme="minorHAnsi" w:cstheme="minorBidi"/>
+          <w:kern w:val="2"/>
+          <w14:ligatures w14:val="standardContextual"/>
+        </w:rPr>
+      </w:pPr>
+      <w:r>
+        <w:rPr>
+          <w:rFonts w:asciiTheme="minorHAnsi" w:eastAsiaTheme="minorHAnsi" w:hAnsiTheme="minorHAnsi" w:cstheme="minorBidi"/>
+          <w:kern w:val="2"/>
+          <w14:ligatures w14:val="standardContextual"/>
+        </w:rPr>
         <w:lastRenderedPageBreak/>
-        <w:t xml:space="preserve">revenue across all regions they need to manually combine the data from both shards. Also, one issue that we found is that if table products need to be updated, they need to be synchronized in both shards and that adds extra work for the company. Finally, we found that this design can create uneven data distribution, because one shard can get much more data and traffic than other and that can affect the company workflow and complicate solutions. </w:t>
+        <w:t>On the other hand, there are several drawbacks. The biggest challenge is that cross-shard queries require application-level aggregation. For example, to get total revenue by state across all regions, the company needs to run separate queries on each shard and then combine the results manually. Reference tables like products also need to be kept synchronized across all shards, which adds extra maintenance work. The ETL pipeline becomes more complex too, because instead of extracting from one database the script now needs to connect to multiple shards and merge the data. Another problem is uneven data distribution, which creates hot shards where one shard receives much more traffic than the other. Finally, there are no cross-shard foreign keys or transactions, so the system cannot enforce data consistency rules across shards.</w:t>
       </w:r>
     </w:p>
     <w:p>
@@ -11196,18 +11210,7 @@
           <w:sz w:val="22"/>
           <w:szCs w:val="22"/>
         </w:rPr>
-        <w:t xml:space="preserve"> -U student -d warehouse -c "EXPLAIN ANALYZE </w:t>
-      </w:r>
-      <w:r>
-        <w:rPr>
-          <w:rFonts w:ascii="Menlo" w:hAnsi="Menlo" w:cs="Menlo"/>
-          <w:color w:val="000000"/>
-          <w:kern w:val="0"/>
-          <w:sz w:val="22"/>
-          <w:szCs w:val="22"/>
-        </w:rPr>
-        <w:lastRenderedPageBreak/>
-        <w:t xml:space="preserve">SELECT </w:t>
+        <w:t xml:space="preserve"> -U student -d warehouse -c "EXPLAIN ANALYZE SELECT </w:t>
       </w:r>
       <w:proofErr w:type="spellStart"/>
       <w:proofErr w:type="gramStart"/>
@@ -13067,6 +13070,19 @@
       <w:color w:val="1F3763" w:themeColor="accent1" w:themeShade="7F"/>
     </w:rPr>
   </w:style>
+  <w:style w:type="paragraph" w:customStyle="1" w:styleId="font-claude-response-body">
+    <w:name w:val="font-claude-response-body"/>
+    <w:basedOn w:val="Normal"/>
+    <w:rsid w:val="00C35977"/>
+    <w:pPr>
+      <w:spacing w:before="100" w:beforeAutospacing="1" w:after="100" w:afterAutospacing="1"/>
+    </w:pPr>
+    <w:rPr>
+      <w:rFonts w:ascii="Times New Roman" w:eastAsia="Times New Roman" w:hAnsi="Times New Roman" w:cs="Times New Roman"/>
+      <w:kern w:val="0"/>
+      <w14:ligatures w14:val="none"/>
+    </w:rPr>
+  </w:style>
 </w:styles>
 </file>
 

</xml_diff>